<commit_message>
vault backup: 2026-07-09 13:17:18
</commit_message>
<xml_diff>
--- a/求职/CV/AgentDev/agentCV.docx
+++ b/求职/CV/AgentDev/agentCV.docx
@@ -182,8 +182,9 @@
     <w:p>
       <w:pPr>
         <w:rPr>
-          <w:rFonts w:ascii="Tahoma" w:hAnsi="Tahoma" w:cs="Tahoma"/>
-          <w:szCs w:val="21"/>
+          <w:rFonts w:ascii="Tahoma" w:hAnsi="Tahoma" w:cs="Tahoma" w:hint="eastAsia"/>
+          <w:sz w:val="15"/>
+          <w:szCs w:val="15"/>
         </w:rPr>
       </w:pPr>
       <w:r>
@@ -237,35 +238,40 @@
       <w:r>
         <w:rPr>
           <w:rFonts w:ascii="Tahoma" w:hAnsi="Tahoma" w:cs="Tahoma"/>
-          <w:szCs w:val="21"/>
+          <w:sz w:val="15"/>
+          <w:szCs w:val="15"/>
         </w:rPr>
         <w:t>计算机科学</w:t>
       </w:r>
       <w:r>
         <w:rPr>
           <w:rFonts w:ascii="Tahoma" w:hAnsi="Tahoma" w:cs="Tahoma"/>
-          <w:szCs w:val="21"/>
+          <w:sz w:val="15"/>
+          <w:szCs w:val="15"/>
         </w:rPr>
         <w:t xml:space="preserve"> </w:t>
       </w:r>
       <w:r>
         <w:rPr>
           <w:rFonts w:ascii="Tahoma" w:hAnsi="Tahoma" w:cs="Tahoma"/>
-          <w:szCs w:val="21"/>
+          <w:sz w:val="15"/>
+          <w:szCs w:val="15"/>
         </w:rPr>
         <w:t>本科，西交利物浦大学</w:t>
       </w:r>
       <w:r>
         <w:rPr>
           <w:rFonts w:ascii="Tahoma" w:hAnsi="Tahoma" w:cs="Tahoma"/>
-          <w:szCs w:val="21"/>
+          <w:sz w:val="15"/>
+          <w:szCs w:val="15"/>
         </w:rPr>
         <w:t xml:space="preserve"> 2+2 </w:t>
       </w:r>
       <w:r>
         <w:rPr>
           <w:rFonts w:ascii="Tahoma" w:hAnsi="Tahoma" w:cs="Tahoma"/>
-          <w:szCs w:val="21"/>
+          <w:sz w:val="15"/>
+          <w:szCs w:val="15"/>
         </w:rPr>
         <w:t>项目，一等荣誉学位</w:t>
       </w:r>
@@ -282,8 +288,849 @@
           <w:rFonts w:ascii="Tahoma" w:hAnsi="Tahoma" w:cs="Tahoma"/>
           <w:szCs w:val="21"/>
         </w:rPr>
+        <w:pict w14:anchorId="57908F82">
+          <v:rect id="_x0000_i1030" style="width:0;height:1.5pt" o:hralign="center" o:hrstd="t" o:hr="t" fillcolor="#a0a0a0" stroked="f"/>
+        </w:pict>
+      </w:r>
+    </w:p>
+    <w:p>
+      <w:pPr>
+        <w:rPr>
+          <w:rFonts w:ascii="Tahoma" w:hAnsi="Tahoma" w:cs="Tahoma"/>
+          <w:b/>
+          <w:bCs/>
+          <w:sz w:val="24"/>
+          <w:szCs w:val="24"/>
+        </w:rPr>
+      </w:pPr>
+      <w:r>
+        <w:rPr>
+          <w:rFonts w:ascii="Tahoma" w:hAnsi="Tahoma" w:cs="Tahoma"/>
+          <w:b/>
+          <w:bCs/>
+          <w:sz w:val="24"/>
+          <w:szCs w:val="24"/>
+        </w:rPr>
+        <w:t>技术能力</w:t>
+      </w:r>
+    </w:p>
+    <w:p>
+      <w:pPr>
+        <w:rPr>
+          <w:rFonts w:ascii="Tahoma" w:hAnsi="Tahoma" w:cs="Tahoma"/>
+          <w:szCs w:val="21"/>
+        </w:rPr>
+      </w:pPr>
+      <w:r>
+        <w:rPr>
+          <w:rFonts w:ascii="Tahoma" w:hAnsi="Tahoma" w:cs="Tahoma"/>
+          <w:b/>
+          <w:bCs/>
+          <w:szCs w:val="21"/>
+        </w:rPr>
+        <w:t>编程语言与工程开发：</w:t>
+      </w:r>
+      <w:r>
+        <w:rPr>
+          <w:rFonts w:ascii="Tahoma" w:hAnsi="Tahoma" w:cs="Tahoma"/>
+          <w:szCs w:val="21"/>
+        </w:rPr>
+        <w:t xml:space="preserve"> </w:t>
+      </w:r>
+      <w:r>
+        <w:rPr>
+          <w:rFonts w:ascii="Tahoma" w:hAnsi="Tahoma" w:cs="Tahoma"/>
+          <w:szCs w:val="21"/>
+        </w:rPr>
+        <w:t>熟悉</w:t>
+      </w:r>
+      <w:r>
+        <w:rPr>
+          <w:rFonts w:ascii="Tahoma" w:hAnsi="Tahoma" w:cs="Tahoma"/>
+          <w:szCs w:val="21"/>
+        </w:rPr>
+        <w:t xml:space="preserve"> Python</w:t>
+      </w:r>
+      <w:r>
+        <w:rPr>
+          <w:rFonts w:ascii="Tahoma" w:hAnsi="Tahoma" w:cs="Tahoma"/>
+          <w:szCs w:val="21"/>
+        </w:rPr>
+        <w:t>、</w:t>
+      </w:r>
+      <w:r>
+        <w:rPr>
+          <w:rFonts w:ascii="Tahoma" w:hAnsi="Tahoma" w:cs="Tahoma"/>
+          <w:szCs w:val="21"/>
+        </w:rPr>
+        <w:t>C/C++</w:t>
+      </w:r>
+      <w:r>
+        <w:rPr>
+          <w:rFonts w:ascii="Tahoma" w:hAnsi="Tahoma" w:cs="Tahoma"/>
+          <w:szCs w:val="21"/>
+        </w:rPr>
+        <w:t>，掌握</w:t>
+      </w:r>
+      <w:r>
+        <w:rPr>
+          <w:rFonts w:ascii="Tahoma" w:hAnsi="Tahoma" w:cs="Tahoma"/>
+          <w:szCs w:val="21"/>
+        </w:rPr>
+        <w:t xml:space="preserve"> SQL </w:t>
+      </w:r>
+      <w:r>
+        <w:rPr>
+          <w:rFonts w:ascii="Tahoma" w:hAnsi="Tahoma" w:cs="Tahoma"/>
+          <w:szCs w:val="21"/>
+        </w:rPr>
+        <w:t>基础，了解</w:t>
+      </w:r>
+      <w:r>
+        <w:rPr>
+          <w:rFonts w:ascii="Tahoma" w:hAnsi="Tahoma" w:cs="Tahoma"/>
+          <w:szCs w:val="21"/>
+        </w:rPr>
+        <w:t xml:space="preserve"> JavaScript</w:t>
+      </w:r>
+      <w:r>
+        <w:rPr>
+          <w:rFonts w:ascii="Tahoma" w:hAnsi="Tahoma" w:cs="Tahoma"/>
+          <w:szCs w:val="21"/>
+        </w:rPr>
+        <w:t>、</w:t>
+      </w:r>
+      <w:r>
+        <w:rPr>
+          <w:rFonts w:ascii="Tahoma" w:hAnsi="Tahoma" w:cs="Tahoma"/>
+          <w:szCs w:val="21"/>
+        </w:rPr>
+        <w:t>HTML</w:t>
+      </w:r>
+      <w:r>
+        <w:rPr>
+          <w:rFonts w:ascii="Tahoma" w:hAnsi="Tahoma" w:cs="Tahoma"/>
+          <w:szCs w:val="21"/>
+        </w:rPr>
+        <w:t>、</w:t>
+      </w:r>
+      <w:r>
+        <w:rPr>
+          <w:rFonts w:ascii="Tahoma" w:hAnsi="Tahoma" w:cs="Tahoma"/>
+          <w:szCs w:val="21"/>
+        </w:rPr>
+        <w:t>CSS</w:t>
+      </w:r>
+      <w:r>
+        <w:rPr>
+          <w:rFonts w:ascii="Tahoma" w:hAnsi="Tahoma" w:cs="Tahoma"/>
+          <w:szCs w:val="21"/>
+        </w:rPr>
+        <w:t>；能够使用</w:t>
+      </w:r>
+      <w:r>
+        <w:rPr>
+          <w:rFonts w:ascii="Tahoma" w:hAnsi="Tahoma" w:cs="Tahoma"/>
+          <w:szCs w:val="21"/>
+        </w:rPr>
+        <w:t xml:space="preserve"> Python </w:t>
+      </w:r>
+      <w:r>
+        <w:rPr>
+          <w:rFonts w:ascii="Tahoma" w:hAnsi="Tahoma" w:cs="Tahoma"/>
+          <w:szCs w:val="21"/>
+        </w:rPr>
+        <w:t>完成</w:t>
+      </w:r>
+      <w:r>
+        <w:rPr>
+          <w:rFonts w:ascii="Tahoma" w:hAnsi="Tahoma" w:cs="Tahoma"/>
+          <w:szCs w:val="21"/>
+        </w:rPr>
+        <w:t xml:space="preserve"> AI </w:t>
+      </w:r>
+      <w:r>
+        <w:rPr>
+          <w:rFonts w:ascii="Tahoma" w:hAnsi="Tahoma" w:cs="Tahoma"/>
+          <w:szCs w:val="21"/>
+        </w:rPr>
+        <w:t>应用原型开发、后端接口实现、数据处理、日志解析、实验自动化和模型训练流程。</w:t>
+      </w:r>
+    </w:p>
+    <w:p>
+      <w:pPr>
+        <w:rPr>
+          <w:rFonts w:ascii="Tahoma" w:hAnsi="Tahoma" w:cs="Tahoma"/>
+          <w:szCs w:val="21"/>
+        </w:rPr>
+      </w:pPr>
+      <w:r>
+        <w:rPr>
+          <w:rFonts w:ascii="Tahoma" w:hAnsi="Tahoma" w:cs="Tahoma"/>
+          <w:b/>
+          <w:bCs/>
+          <w:szCs w:val="21"/>
+        </w:rPr>
+        <w:t xml:space="preserve">AI Agent </w:t>
+      </w:r>
+      <w:r>
+        <w:rPr>
+          <w:rFonts w:ascii="Tahoma" w:hAnsi="Tahoma" w:cs="Tahoma"/>
+          <w:b/>
+          <w:bCs/>
+          <w:szCs w:val="21"/>
+        </w:rPr>
+        <w:t>与</w:t>
+      </w:r>
+      <w:r>
+        <w:rPr>
+          <w:rFonts w:ascii="Tahoma" w:hAnsi="Tahoma" w:cs="Tahoma"/>
+          <w:b/>
+          <w:bCs/>
+          <w:szCs w:val="21"/>
+        </w:rPr>
+        <w:t xml:space="preserve"> LLM </w:t>
+      </w:r>
+      <w:r>
+        <w:rPr>
+          <w:rFonts w:ascii="Tahoma" w:hAnsi="Tahoma" w:cs="Tahoma"/>
+          <w:b/>
+          <w:bCs/>
+          <w:szCs w:val="21"/>
+        </w:rPr>
+        <w:t>应用：</w:t>
+      </w:r>
+      <w:r>
+        <w:rPr>
+          <w:rFonts w:ascii="Tahoma" w:hAnsi="Tahoma" w:cs="Tahoma"/>
+          <w:szCs w:val="21"/>
+        </w:rPr>
+        <w:t xml:space="preserve"> </w:t>
+      </w:r>
+      <w:r>
+        <w:rPr>
+          <w:rFonts w:ascii="Tahoma" w:hAnsi="Tahoma" w:cs="Tahoma"/>
+          <w:szCs w:val="21"/>
+        </w:rPr>
+        <w:t>了解</w:t>
+      </w:r>
+      <w:r>
+        <w:rPr>
+          <w:rFonts w:ascii="Tahoma" w:hAnsi="Tahoma" w:cs="Tahoma"/>
+          <w:szCs w:val="21"/>
+        </w:rPr>
+        <w:t xml:space="preserve"> LLM Agent </w:t>
+      </w:r>
+      <w:r>
+        <w:rPr>
+          <w:rFonts w:ascii="Tahoma" w:hAnsi="Tahoma" w:cs="Tahoma"/>
+          <w:szCs w:val="21"/>
+        </w:rPr>
+        <w:t>基本架构，包括</w:t>
+      </w:r>
+      <w:r>
+        <w:rPr>
+          <w:rFonts w:ascii="Tahoma" w:hAnsi="Tahoma" w:cs="Tahoma"/>
+          <w:szCs w:val="21"/>
+        </w:rPr>
+        <w:t xml:space="preserve"> tool calling</w:t>
+      </w:r>
+      <w:r>
+        <w:rPr>
+          <w:rFonts w:ascii="Tahoma" w:hAnsi="Tahoma" w:cs="Tahoma"/>
+          <w:szCs w:val="21"/>
+        </w:rPr>
+        <w:t>、任务分解、</w:t>
+      </w:r>
+      <w:r>
+        <w:rPr>
+          <w:rFonts w:ascii="Tahoma" w:hAnsi="Tahoma" w:cs="Tahoma"/>
+          <w:szCs w:val="21"/>
+        </w:rPr>
+        <w:t xml:space="preserve">RAG </w:t>
+      </w:r>
+      <w:r>
+        <w:rPr>
+          <w:rFonts w:ascii="Tahoma" w:hAnsi="Tahoma" w:cs="Tahoma"/>
+          <w:szCs w:val="21"/>
+        </w:rPr>
+        <w:t>检索增强生成、</w:t>
+      </w:r>
+      <w:r>
+        <w:rPr>
+          <w:rFonts w:ascii="Tahoma" w:hAnsi="Tahoma" w:cs="Tahoma"/>
+          <w:szCs w:val="21"/>
+        </w:rPr>
+        <w:t>prompt engineering</w:t>
+      </w:r>
+      <w:r>
+        <w:rPr>
+          <w:rFonts w:ascii="Tahoma" w:hAnsi="Tahoma" w:cs="Tahoma"/>
+          <w:szCs w:val="21"/>
+        </w:rPr>
+        <w:t>、记忆管理、多轮对</w:t>
+      </w:r>
+      <w:proofErr w:type="gramStart"/>
+      <w:r>
+        <w:rPr>
+          <w:rFonts w:ascii="Tahoma" w:hAnsi="Tahoma" w:cs="Tahoma"/>
+          <w:szCs w:val="21"/>
+        </w:rPr>
+        <w:t>话状态</w:t>
+      </w:r>
+      <w:proofErr w:type="gramEnd"/>
+      <w:r>
+        <w:rPr>
+          <w:rFonts w:ascii="Tahoma" w:hAnsi="Tahoma" w:cs="Tahoma"/>
+          <w:szCs w:val="21"/>
+        </w:rPr>
+        <w:t>管理和</w:t>
+      </w:r>
+      <w:r>
+        <w:rPr>
+          <w:rFonts w:ascii="Tahoma" w:hAnsi="Tahoma" w:cs="Tahoma"/>
+          <w:szCs w:val="21"/>
+        </w:rPr>
+        <w:t xml:space="preserve"> Markdown </w:t>
+      </w:r>
+      <w:r>
+        <w:rPr>
+          <w:rFonts w:ascii="Tahoma" w:hAnsi="Tahoma" w:cs="Tahoma"/>
+          <w:szCs w:val="21"/>
+        </w:rPr>
+        <w:t>报告生成；具备将大模型能力与外部工具、文件系统、数据库、缓存和自动化脚本结合的项目开发经验。</w:t>
+      </w:r>
+    </w:p>
+    <w:p>
+      <w:pPr>
+        <w:rPr>
+          <w:rFonts w:ascii="Tahoma" w:hAnsi="Tahoma" w:cs="Tahoma"/>
+          <w:szCs w:val="21"/>
+        </w:rPr>
+      </w:pPr>
+      <w:r>
+        <w:rPr>
+          <w:rFonts w:ascii="Tahoma" w:hAnsi="Tahoma" w:cs="Tahoma"/>
+          <w:b/>
+          <w:bCs/>
+          <w:szCs w:val="21"/>
+        </w:rPr>
+        <w:t xml:space="preserve">RAG </w:t>
+      </w:r>
+      <w:r>
+        <w:rPr>
+          <w:rFonts w:ascii="Tahoma" w:hAnsi="Tahoma" w:cs="Tahoma"/>
+          <w:b/>
+          <w:bCs/>
+          <w:szCs w:val="21"/>
+        </w:rPr>
+        <w:t>与向量检索：</w:t>
+      </w:r>
+      <w:r>
+        <w:rPr>
+          <w:rFonts w:ascii="Tahoma" w:hAnsi="Tahoma" w:cs="Tahoma"/>
+          <w:szCs w:val="21"/>
+        </w:rPr>
+        <w:t xml:space="preserve"> </w:t>
+      </w:r>
+      <w:r>
+        <w:rPr>
+          <w:rFonts w:ascii="Tahoma" w:hAnsi="Tahoma" w:cs="Tahoma"/>
+          <w:szCs w:val="21"/>
+        </w:rPr>
+        <w:t>了解</w:t>
+      </w:r>
+      <w:r>
+        <w:rPr>
+          <w:rFonts w:ascii="Tahoma" w:hAnsi="Tahoma" w:cs="Tahoma"/>
+          <w:szCs w:val="21"/>
+        </w:rPr>
+        <w:t xml:space="preserve"> Markdown </w:t>
+      </w:r>
+      <w:r>
+        <w:rPr>
+          <w:rFonts w:ascii="Tahoma" w:hAnsi="Tahoma" w:cs="Tahoma"/>
+          <w:szCs w:val="21"/>
+        </w:rPr>
+        <w:t>文档解析、文本切分、</w:t>
+      </w:r>
+      <w:r>
+        <w:rPr>
+          <w:rFonts w:ascii="Tahoma" w:hAnsi="Tahoma" w:cs="Tahoma"/>
+          <w:szCs w:val="21"/>
+        </w:rPr>
+        <w:t xml:space="preserve">embedding </w:t>
+      </w:r>
+      <w:r>
+        <w:rPr>
+          <w:rFonts w:ascii="Tahoma" w:hAnsi="Tahoma" w:cs="Tahoma"/>
+          <w:szCs w:val="21"/>
+        </w:rPr>
+        <w:t>生成、</w:t>
+      </w:r>
+      <w:r>
+        <w:rPr>
+          <w:rFonts w:ascii="Tahoma" w:hAnsi="Tahoma" w:cs="Tahoma"/>
+          <w:szCs w:val="21"/>
+        </w:rPr>
+        <w:t xml:space="preserve">FAISS / Chroma </w:t>
+      </w:r>
+      <w:r>
+        <w:rPr>
+          <w:rFonts w:ascii="Tahoma" w:hAnsi="Tahoma" w:cs="Tahoma"/>
+          <w:szCs w:val="21"/>
+        </w:rPr>
+        <w:t>向量索引、</w:t>
+      </w:r>
+      <w:r>
+        <w:rPr>
+          <w:rFonts w:ascii="Tahoma" w:hAnsi="Tahoma" w:cs="Tahoma"/>
+          <w:szCs w:val="21"/>
+        </w:rPr>
+        <w:t xml:space="preserve">top-k </w:t>
+      </w:r>
+      <w:r>
+        <w:rPr>
+          <w:rFonts w:ascii="Tahoma" w:hAnsi="Tahoma" w:cs="Tahoma"/>
+          <w:szCs w:val="21"/>
+        </w:rPr>
+        <w:t>语义检索和上下文拼接流程；能够围绕领域知识库构建检索增强问答与报告生成系统。</w:t>
+      </w:r>
+    </w:p>
+    <w:p>
+      <w:pPr>
+        <w:rPr>
+          <w:rFonts w:ascii="Tahoma" w:hAnsi="Tahoma" w:cs="Tahoma"/>
+          <w:szCs w:val="21"/>
+        </w:rPr>
+      </w:pPr>
+      <w:r>
+        <w:rPr>
+          <w:rFonts w:ascii="Tahoma" w:hAnsi="Tahoma" w:cs="Tahoma"/>
+          <w:b/>
+          <w:bCs/>
+          <w:szCs w:val="21"/>
+        </w:rPr>
+        <w:t>后端与系统设计基础</w:t>
+      </w:r>
+      <w:r>
+        <w:rPr>
+          <w:rFonts w:ascii="Tahoma" w:hAnsi="Tahoma" w:cs="Tahoma"/>
+          <w:szCs w:val="21"/>
+        </w:rPr>
+        <w:t>：</w:t>
+      </w:r>
+      <w:r>
+        <w:rPr>
+          <w:rFonts w:ascii="Tahoma" w:hAnsi="Tahoma" w:cs="Tahoma"/>
+          <w:szCs w:val="21"/>
+        </w:rPr>
+        <w:t xml:space="preserve"> </w:t>
+      </w:r>
+      <w:r>
+        <w:rPr>
+          <w:rFonts w:ascii="Tahoma" w:hAnsi="Tahoma" w:cs="Tahoma"/>
+          <w:szCs w:val="21"/>
+        </w:rPr>
+        <w:t>了解</w:t>
+      </w:r>
+      <w:r>
+        <w:rPr>
+          <w:rFonts w:ascii="Tahoma" w:hAnsi="Tahoma" w:cs="Tahoma"/>
+          <w:szCs w:val="21"/>
+        </w:rPr>
+        <w:t xml:space="preserve"> </w:t>
+      </w:r>
+      <w:proofErr w:type="spellStart"/>
+      <w:r>
+        <w:rPr>
+          <w:rFonts w:ascii="Tahoma" w:hAnsi="Tahoma" w:cs="Tahoma"/>
+          <w:szCs w:val="21"/>
+        </w:rPr>
+        <w:t>FastAPI</w:t>
+      </w:r>
+      <w:proofErr w:type="spellEnd"/>
+      <w:r>
+        <w:rPr>
+          <w:rFonts w:ascii="Tahoma" w:hAnsi="Tahoma" w:cs="Tahoma"/>
+          <w:szCs w:val="21"/>
+        </w:rPr>
+        <w:t>、</w:t>
+      </w:r>
+      <w:r>
+        <w:rPr>
+          <w:rFonts w:ascii="Tahoma" w:hAnsi="Tahoma" w:cs="Tahoma"/>
+          <w:szCs w:val="21"/>
+        </w:rPr>
+        <w:t>REST API</w:t>
+      </w:r>
+      <w:r>
+        <w:rPr>
+          <w:rFonts w:ascii="Tahoma" w:hAnsi="Tahoma" w:cs="Tahoma"/>
+          <w:szCs w:val="21"/>
+        </w:rPr>
+        <w:t>、</w:t>
+      </w:r>
+      <w:r>
+        <w:rPr>
+          <w:rFonts w:ascii="Tahoma" w:hAnsi="Tahoma" w:cs="Tahoma"/>
+          <w:szCs w:val="21"/>
+        </w:rPr>
+        <w:t>HTTP</w:t>
+      </w:r>
+      <w:r>
+        <w:rPr>
+          <w:rFonts w:ascii="Tahoma" w:hAnsi="Tahoma" w:cs="Tahoma"/>
+          <w:szCs w:val="21"/>
+        </w:rPr>
+        <w:t>、客户端与服务端交互、参数校验、异常处理、日志追踪、</w:t>
+      </w:r>
+      <w:proofErr w:type="spellStart"/>
+      <w:r>
+        <w:rPr>
+          <w:rFonts w:ascii="Tahoma" w:hAnsi="Tahoma" w:cs="Tahoma"/>
+          <w:szCs w:val="21"/>
+        </w:rPr>
+        <w:t>TraceID</w:t>
+      </w:r>
+      <w:proofErr w:type="spellEnd"/>
+      <w:r>
+        <w:rPr>
+          <w:rFonts w:ascii="Tahoma" w:hAnsi="Tahoma" w:cs="Tahoma"/>
+          <w:szCs w:val="21"/>
+        </w:rPr>
+        <w:t>、任务调度、限流、</w:t>
+      </w:r>
+      <w:proofErr w:type="gramStart"/>
+      <w:r>
+        <w:rPr>
+          <w:rFonts w:ascii="Tahoma" w:hAnsi="Tahoma" w:cs="Tahoma"/>
+          <w:szCs w:val="21"/>
+        </w:rPr>
+        <w:t>幂</w:t>
+      </w:r>
+      <w:proofErr w:type="gramEnd"/>
+      <w:r>
+        <w:rPr>
+          <w:rFonts w:ascii="Tahoma" w:hAnsi="Tahoma" w:cs="Tahoma"/>
+          <w:szCs w:val="21"/>
+        </w:rPr>
+        <w:t>等性和可观测性等后端工程概念。</w:t>
+      </w:r>
+    </w:p>
+    <w:p>
+      <w:pPr>
+        <w:rPr>
+          <w:rFonts w:ascii="Tahoma" w:hAnsi="Tahoma" w:cs="Tahoma"/>
+          <w:szCs w:val="21"/>
+        </w:rPr>
+      </w:pPr>
+      <w:r>
+        <w:rPr>
+          <w:rFonts w:ascii="Tahoma" w:hAnsi="Tahoma" w:cs="Tahoma"/>
+          <w:b/>
+          <w:bCs/>
+          <w:szCs w:val="21"/>
+        </w:rPr>
+        <w:t>数据库与缓存</w:t>
+      </w:r>
+      <w:r>
+        <w:rPr>
+          <w:rFonts w:ascii="Tahoma" w:hAnsi="Tahoma" w:cs="Tahoma"/>
+          <w:szCs w:val="21"/>
+        </w:rPr>
+        <w:t>：</w:t>
+      </w:r>
+      <w:r>
+        <w:rPr>
+          <w:rFonts w:ascii="Tahoma" w:hAnsi="Tahoma" w:cs="Tahoma"/>
+          <w:szCs w:val="21"/>
+        </w:rPr>
+        <w:t xml:space="preserve"> </w:t>
+      </w:r>
+      <w:r>
+        <w:rPr>
+          <w:rFonts w:ascii="Tahoma" w:hAnsi="Tahoma" w:cs="Tahoma"/>
+          <w:szCs w:val="21"/>
+        </w:rPr>
+        <w:t>了解</w:t>
+      </w:r>
+      <w:r>
+        <w:rPr>
+          <w:rFonts w:ascii="Tahoma" w:hAnsi="Tahoma" w:cs="Tahoma"/>
+          <w:szCs w:val="21"/>
+        </w:rPr>
+        <w:t xml:space="preserve"> MySQL / SQLite </w:t>
+      </w:r>
+      <w:r>
+        <w:rPr>
+          <w:rFonts w:ascii="Tahoma" w:hAnsi="Tahoma" w:cs="Tahoma"/>
+          <w:szCs w:val="21"/>
+        </w:rPr>
+        <w:t>基础使用，理解索引、事务、锁、查询优化等数据库基础概念；了解</w:t>
+      </w:r>
+      <w:r>
+        <w:rPr>
+          <w:rFonts w:ascii="Tahoma" w:hAnsi="Tahoma" w:cs="Tahoma"/>
+          <w:szCs w:val="21"/>
+        </w:rPr>
+        <w:t xml:space="preserve"> Redis </w:t>
+      </w:r>
+      <w:r>
+        <w:rPr>
+          <w:rFonts w:ascii="Tahoma" w:hAnsi="Tahoma" w:cs="Tahoma"/>
+          <w:szCs w:val="21"/>
+        </w:rPr>
+        <w:t>常用缓存场景，包括热点查询缓存、短期会话状态、</w:t>
+      </w:r>
+      <w:r>
+        <w:rPr>
+          <w:rFonts w:ascii="Tahoma" w:hAnsi="Tahoma" w:cs="Tahoma"/>
+          <w:szCs w:val="21"/>
+        </w:rPr>
+        <w:t>TTL</w:t>
+      </w:r>
+      <w:r>
+        <w:rPr>
+          <w:rFonts w:ascii="Tahoma" w:hAnsi="Tahoma" w:cs="Tahoma"/>
+          <w:szCs w:val="21"/>
+        </w:rPr>
+        <w:t>、缓存穿透、缓存击穿和缓存一致性。</w:t>
+      </w:r>
+    </w:p>
+    <w:p>
+      <w:pPr>
+        <w:rPr>
+          <w:rFonts w:ascii="Tahoma" w:hAnsi="Tahoma" w:cs="Tahoma"/>
+          <w:szCs w:val="21"/>
+        </w:rPr>
+      </w:pPr>
+      <w:r>
+        <w:rPr>
+          <w:rFonts w:ascii="Tahoma" w:hAnsi="Tahoma" w:cs="Tahoma"/>
+          <w:b/>
+          <w:bCs/>
+          <w:szCs w:val="21"/>
+        </w:rPr>
+        <w:t>机器学习与数据分析</w:t>
+      </w:r>
+      <w:r>
+        <w:rPr>
+          <w:rFonts w:ascii="Tahoma" w:hAnsi="Tahoma" w:cs="Tahoma"/>
+          <w:szCs w:val="21"/>
+        </w:rPr>
+        <w:t>：</w:t>
+      </w:r>
+      <w:r>
+        <w:rPr>
+          <w:rFonts w:ascii="Tahoma" w:hAnsi="Tahoma" w:cs="Tahoma"/>
+          <w:szCs w:val="21"/>
+        </w:rPr>
+        <w:t xml:space="preserve"> </w:t>
+      </w:r>
+      <w:r>
+        <w:rPr>
+          <w:rFonts w:ascii="Tahoma" w:hAnsi="Tahoma" w:cs="Tahoma"/>
+          <w:szCs w:val="21"/>
+        </w:rPr>
+        <w:t>熟悉</w:t>
+      </w:r>
+      <w:r>
+        <w:rPr>
+          <w:rFonts w:ascii="Tahoma" w:hAnsi="Tahoma" w:cs="Tahoma"/>
+          <w:szCs w:val="21"/>
+        </w:rPr>
+        <w:t xml:space="preserve"> </w:t>
+      </w:r>
+      <w:proofErr w:type="spellStart"/>
+      <w:r>
+        <w:rPr>
+          <w:rFonts w:ascii="Tahoma" w:hAnsi="Tahoma" w:cs="Tahoma"/>
+          <w:szCs w:val="21"/>
+        </w:rPr>
+        <w:t>PyTorch</w:t>
+      </w:r>
+      <w:proofErr w:type="spellEnd"/>
+      <w:r>
+        <w:rPr>
+          <w:rFonts w:ascii="Tahoma" w:hAnsi="Tahoma" w:cs="Tahoma"/>
+          <w:szCs w:val="21"/>
+        </w:rPr>
+        <w:t>，具备深度学习和多智能体强化学习算法实现与实验评估经验；熟悉</w:t>
+      </w:r>
+      <w:r>
+        <w:rPr>
+          <w:rFonts w:ascii="Tahoma" w:hAnsi="Tahoma" w:cs="Tahoma"/>
+          <w:szCs w:val="21"/>
+        </w:rPr>
+        <w:t xml:space="preserve"> Pandas</w:t>
+      </w:r>
+      <w:r>
+        <w:rPr>
+          <w:rFonts w:ascii="Tahoma" w:hAnsi="Tahoma" w:cs="Tahoma"/>
+          <w:szCs w:val="21"/>
+        </w:rPr>
+        <w:t>、</w:t>
+      </w:r>
+      <w:r>
+        <w:rPr>
+          <w:rFonts w:ascii="Tahoma" w:hAnsi="Tahoma" w:cs="Tahoma"/>
+          <w:szCs w:val="21"/>
+        </w:rPr>
+        <w:t>NumPy</w:t>
+      </w:r>
+      <w:r>
+        <w:rPr>
+          <w:rFonts w:ascii="Tahoma" w:hAnsi="Tahoma" w:cs="Tahoma"/>
+          <w:szCs w:val="21"/>
+        </w:rPr>
+        <w:t>、</w:t>
+      </w:r>
+      <w:r>
+        <w:rPr>
+          <w:rFonts w:ascii="Tahoma" w:hAnsi="Tahoma" w:cs="Tahoma"/>
+          <w:szCs w:val="21"/>
+        </w:rPr>
+        <w:t>Matplotlib</w:t>
+      </w:r>
+      <w:r>
+        <w:rPr>
+          <w:rFonts w:ascii="Tahoma" w:hAnsi="Tahoma" w:cs="Tahoma"/>
+          <w:szCs w:val="21"/>
+        </w:rPr>
+        <w:t>，可完成结构化数据处理、指标计算、实验日志分析和可视化。</w:t>
+      </w:r>
+    </w:p>
+    <w:p>
+      <w:pPr>
+        <w:rPr>
+          <w:rFonts w:ascii="Tahoma" w:hAnsi="Tahoma" w:cs="Tahoma"/>
+          <w:szCs w:val="21"/>
+        </w:rPr>
+      </w:pPr>
+      <w:r>
+        <w:rPr>
+          <w:rFonts w:ascii="Tahoma" w:hAnsi="Tahoma" w:cs="Tahoma"/>
+          <w:b/>
+          <w:bCs/>
+          <w:szCs w:val="21"/>
+        </w:rPr>
+        <w:t>工具与开发环境</w:t>
+      </w:r>
+      <w:r>
+        <w:rPr>
+          <w:rFonts w:ascii="Tahoma" w:hAnsi="Tahoma" w:cs="Tahoma"/>
+          <w:szCs w:val="21"/>
+        </w:rPr>
+        <w:t>：</w:t>
+      </w:r>
+      <w:r>
+        <w:rPr>
+          <w:rFonts w:ascii="Tahoma" w:hAnsi="Tahoma" w:cs="Tahoma"/>
+          <w:szCs w:val="21"/>
+        </w:rPr>
+        <w:t xml:space="preserve"> </w:t>
+      </w:r>
+      <w:r>
+        <w:rPr>
+          <w:rFonts w:ascii="Tahoma" w:hAnsi="Tahoma" w:cs="Tahoma"/>
+          <w:szCs w:val="21"/>
+        </w:rPr>
+        <w:t>熟悉</w:t>
+      </w:r>
+      <w:r>
+        <w:rPr>
+          <w:rFonts w:ascii="Tahoma" w:hAnsi="Tahoma" w:cs="Tahoma"/>
+          <w:szCs w:val="21"/>
+        </w:rPr>
+        <w:t xml:space="preserve"> Linux</w:t>
+      </w:r>
+      <w:r>
+        <w:rPr>
+          <w:rFonts w:ascii="Tahoma" w:hAnsi="Tahoma" w:cs="Tahoma"/>
+          <w:szCs w:val="21"/>
+        </w:rPr>
+        <w:t>、</w:t>
+      </w:r>
+      <w:r>
+        <w:rPr>
+          <w:rFonts w:ascii="Tahoma" w:hAnsi="Tahoma" w:cs="Tahoma"/>
+          <w:szCs w:val="21"/>
+        </w:rPr>
+        <w:t>Bash</w:t>
+      </w:r>
+      <w:r>
+        <w:rPr>
+          <w:rFonts w:ascii="Tahoma" w:hAnsi="Tahoma" w:cs="Tahoma"/>
+          <w:szCs w:val="21"/>
+        </w:rPr>
+        <w:t>、</w:t>
+      </w:r>
+      <w:r>
+        <w:rPr>
+          <w:rFonts w:ascii="Tahoma" w:hAnsi="Tahoma" w:cs="Tahoma"/>
+          <w:szCs w:val="21"/>
+        </w:rPr>
+        <w:t>Git</w:t>
+      </w:r>
+      <w:r>
+        <w:rPr>
+          <w:rFonts w:ascii="Tahoma" w:hAnsi="Tahoma" w:cs="Tahoma"/>
+          <w:szCs w:val="21"/>
+        </w:rPr>
+        <w:t>、</w:t>
+      </w:r>
+      <w:r>
+        <w:rPr>
+          <w:rFonts w:ascii="Tahoma" w:hAnsi="Tahoma" w:cs="Tahoma"/>
+          <w:szCs w:val="21"/>
+        </w:rPr>
+        <w:t>VS Code</w:t>
+      </w:r>
+      <w:r>
+        <w:rPr>
+          <w:rFonts w:ascii="Tahoma" w:hAnsi="Tahoma" w:cs="Tahoma"/>
+          <w:szCs w:val="21"/>
+        </w:rPr>
+        <w:t>、</w:t>
+      </w:r>
+      <w:r>
+        <w:rPr>
+          <w:rFonts w:ascii="Tahoma" w:hAnsi="Tahoma" w:cs="Tahoma"/>
+          <w:szCs w:val="21"/>
+        </w:rPr>
+        <w:t xml:space="preserve">Docker </w:t>
+      </w:r>
+      <w:r>
+        <w:rPr>
+          <w:rFonts w:ascii="Tahoma" w:hAnsi="Tahoma" w:cs="Tahoma"/>
+          <w:szCs w:val="21"/>
+        </w:rPr>
+        <w:t>基础操作；具备使用自动化脚本管理实验、处理日志、维护项目文档和构建可复现开发流程的经验。</w:t>
+      </w:r>
+    </w:p>
+    <w:p>
+      <w:pPr>
+        <w:rPr>
+          <w:rFonts w:ascii="Tahoma" w:hAnsi="Tahoma" w:cs="Tahoma" w:hint="eastAsia"/>
+          <w:szCs w:val="21"/>
+        </w:rPr>
+      </w:pPr>
+    </w:p>
+    <w:p>
+      <w:pPr>
+        <w:rPr>
+          <w:rFonts w:ascii="Tahoma" w:hAnsi="Tahoma" w:cs="Tahoma"/>
+          <w:szCs w:val="21"/>
+        </w:rPr>
+      </w:pPr>
+      <w:r>
+        <w:rPr>
+          <w:rFonts w:ascii="Tahoma" w:hAnsi="Tahoma" w:cs="Tahoma"/>
+          <w:szCs w:val="21"/>
+        </w:rPr>
         <w:pict w14:anchorId="768CA768">
-          <v:rect id="_x0000_i1026" style="width:0;height:1.5pt" o:hralign="center" o:hrstd="t" o:hr="t" fillcolor="#a0a0a0" stroked="f"/>
+          <v:rect id="_x0000_i1025" style="width:0;height:1.5pt" o:hralign="center" o:hrstd="t" o:hr="t" fillcolor="#a0a0a0" stroked="f"/>
         </w:pict>
       </w:r>
     </w:p>
@@ -1459,7 +2306,15 @@
           <w:rFonts w:ascii="Tahoma" w:hAnsi="Tahoma" w:cs="Tahoma"/>
           <w:sz w:val="22"/>
         </w:rPr>
-        <w:t xml:space="preserve"> TTL </w:t>
+        <w:t xml:space="preserve"> </w:t>
+      </w:r>
+      <w:r>
+        <w:rPr>
+          <w:rFonts w:ascii="Tahoma" w:hAnsi="Tahoma" w:cs="Tahoma"/>
+          <w:sz w:val="22"/>
+        </w:rPr>
+        <w:lastRenderedPageBreak/>
+        <w:t xml:space="preserve">TTL </w:t>
       </w:r>
       <w:r>
         <w:rPr>
@@ -2262,7 +3117,7 @@
           <w:szCs w:val="21"/>
         </w:rPr>
         <w:pict w14:anchorId="0CFF464F">
-          <v:rect id="_x0000_i1087" style="width:0;height:1.5pt" o:hralign="center" o:hrstd="t" o:hr="t" fillcolor="#a0a0a0" stroked="f"/>
+          <v:rect id="_x0000_i1026" style="width:0;height:1.5pt" o:hralign="center" o:hrstd="t" o:hr="t" fillcolor="#a0a0a0" stroked="f"/>
         </w:pict>
       </w:r>
     </w:p>
@@ -2435,7 +3290,6 @@
           <w:bCs/>
           <w:sz w:val="22"/>
         </w:rPr>
-        <w:lastRenderedPageBreak/>
         <w:t>技术</w:t>
       </w:r>
       <w:proofErr w:type="gramStart"/>
@@ -3217,841 +4071,8 @@
           <w:rFonts w:ascii="Tahoma" w:hAnsi="Tahoma" w:cs="Tahoma"/>
           <w:szCs w:val="21"/>
         </w:rPr>
-        <w:pict w14:anchorId="3838EC30">
+        <w:pict w14:anchorId="7AC9BCB5">
           <v:rect id="_x0000_i1028" style="width:0;height:1.5pt" o:hralign="center" o:hrstd="t" o:hr="t" fillcolor="#a0a0a0" stroked="f"/>
-        </w:pict>
-      </w:r>
-    </w:p>
-    <w:p>
-      <w:pPr>
-        <w:rPr>
-          <w:rFonts w:ascii="Tahoma" w:hAnsi="Tahoma" w:cs="Tahoma"/>
-          <w:b/>
-          <w:bCs/>
-          <w:sz w:val="24"/>
-          <w:szCs w:val="24"/>
-        </w:rPr>
-      </w:pPr>
-      <w:r>
-        <w:rPr>
-          <w:rFonts w:ascii="Tahoma" w:hAnsi="Tahoma" w:cs="Tahoma"/>
-          <w:b/>
-          <w:bCs/>
-          <w:sz w:val="24"/>
-          <w:szCs w:val="24"/>
-        </w:rPr>
-        <w:t>技术能力</w:t>
-      </w:r>
-    </w:p>
-    <w:p>
-      <w:pPr>
-        <w:rPr>
-          <w:rFonts w:ascii="Tahoma" w:hAnsi="Tahoma" w:cs="Tahoma"/>
-          <w:szCs w:val="21"/>
-        </w:rPr>
-      </w:pPr>
-      <w:r>
-        <w:rPr>
-          <w:rFonts w:ascii="Tahoma" w:hAnsi="Tahoma" w:cs="Tahoma"/>
-          <w:b/>
-          <w:bCs/>
-          <w:szCs w:val="21"/>
-        </w:rPr>
-        <w:t>编程语言与工程开发：</w:t>
-      </w:r>
-      <w:r>
-        <w:rPr>
-          <w:rFonts w:ascii="Tahoma" w:hAnsi="Tahoma" w:cs="Tahoma"/>
-          <w:szCs w:val="21"/>
-        </w:rPr>
-        <w:t xml:space="preserve"> </w:t>
-      </w:r>
-      <w:r>
-        <w:rPr>
-          <w:rFonts w:ascii="Tahoma" w:hAnsi="Tahoma" w:cs="Tahoma"/>
-          <w:szCs w:val="21"/>
-        </w:rPr>
-        <w:t>熟悉</w:t>
-      </w:r>
-      <w:r>
-        <w:rPr>
-          <w:rFonts w:ascii="Tahoma" w:hAnsi="Tahoma" w:cs="Tahoma"/>
-          <w:szCs w:val="21"/>
-        </w:rPr>
-        <w:t xml:space="preserve"> Python</w:t>
-      </w:r>
-      <w:r>
-        <w:rPr>
-          <w:rFonts w:ascii="Tahoma" w:hAnsi="Tahoma" w:cs="Tahoma"/>
-          <w:szCs w:val="21"/>
-        </w:rPr>
-        <w:t>、</w:t>
-      </w:r>
-      <w:r>
-        <w:rPr>
-          <w:rFonts w:ascii="Tahoma" w:hAnsi="Tahoma" w:cs="Tahoma"/>
-          <w:szCs w:val="21"/>
-        </w:rPr>
-        <w:t>C/C++</w:t>
-      </w:r>
-      <w:r>
-        <w:rPr>
-          <w:rFonts w:ascii="Tahoma" w:hAnsi="Tahoma" w:cs="Tahoma"/>
-          <w:szCs w:val="21"/>
-        </w:rPr>
-        <w:t>，掌握</w:t>
-      </w:r>
-      <w:r>
-        <w:rPr>
-          <w:rFonts w:ascii="Tahoma" w:hAnsi="Tahoma" w:cs="Tahoma"/>
-          <w:szCs w:val="21"/>
-        </w:rPr>
-        <w:t xml:space="preserve"> SQL </w:t>
-      </w:r>
-      <w:r>
-        <w:rPr>
-          <w:rFonts w:ascii="Tahoma" w:hAnsi="Tahoma" w:cs="Tahoma"/>
-          <w:szCs w:val="21"/>
-        </w:rPr>
-        <w:t>基础，了解</w:t>
-      </w:r>
-      <w:r>
-        <w:rPr>
-          <w:rFonts w:ascii="Tahoma" w:hAnsi="Tahoma" w:cs="Tahoma"/>
-          <w:szCs w:val="21"/>
-        </w:rPr>
-        <w:t xml:space="preserve"> JavaScript</w:t>
-      </w:r>
-      <w:r>
-        <w:rPr>
-          <w:rFonts w:ascii="Tahoma" w:hAnsi="Tahoma" w:cs="Tahoma"/>
-          <w:szCs w:val="21"/>
-        </w:rPr>
-        <w:t>、</w:t>
-      </w:r>
-      <w:r>
-        <w:rPr>
-          <w:rFonts w:ascii="Tahoma" w:hAnsi="Tahoma" w:cs="Tahoma"/>
-          <w:szCs w:val="21"/>
-        </w:rPr>
-        <w:t>HTML</w:t>
-      </w:r>
-      <w:r>
-        <w:rPr>
-          <w:rFonts w:ascii="Tahoma" w:hAnsi="Tahoma" w:cs="Tahoma"/>
-          <w:szCs w:val="21"/>
-        </w:rPr>
-        <w:t>、</w:t>
-      </w:r>
-      <w:r>
-        <w:rPr>
-          <w:rFonts w:ascii="Tahoma" w:hAnsi="Tahoma" w:cs="Tahoma"/>
-          <w:szCs w:val="21"/>
-        </w:rPr>
-        <w:t>CSS</w:t>
-      </w:r>
-      <w:r>
-        <w:rPr>
-          <w:rFonts w:ascii="Tahoma" w:hAnsi="Tahoma" w:cs="Tahoma"/>
-          <w:szCs w:val="21"/>
-        </w:rPr>
-        <w:t>；能够使用</w:t>
-      </w:r>
-      <w:r>
-        <w:rPr>
-          <w:rFonts w:ascii="Tahoma" w:hAnsi="Tahoma" w:cs="Tahoma"/>
-          <w:szCs w:val="21"/>
-        </w:rPr>
-        <w:t xml:space="preserve"> Python </w:t>
-      </w:r>
-      <w:r>
-        <w:rPr>
-          <w:rFonts w:ascii="Tahoma" w:hAnsi="Tahoma" w:cs="Tahoma"/>
-          <w:szCs w:val="21"/>
-        </w:rPr>
-        <w:t>完成</w:t>
-      </w:r>
-      <w:r>
-        <w:rPr>
-          <w:rFonts w:ascii="Tahoma" w:hAnsi="Tahoma" w:cs="Tahoma"/>
-          <w:szCs w:val="21"/>
-        </w:rPr>
-        <w:t xml:space="preserve"> AI </w:t>
-      </w:r>
-      <w:r>
-        <w:rPr>
-          <w:rFonts w:ascii="Tahoma" w:hAnsi="Tahoma" w:cs="Tahoma"/>
-          <w:szCs w:val="21"/>
-        </w:rPr>
-        <w:t>应用原型开发、后端接口实现、数据处理、日志解析、实验自动化和模型训练流程。</w:t>
-      </w:r>
-    </w:p>
-    <w:p>
-      <w:pPr>
-        <w:rPr>
-          <w:rFonts w:ascii="Tahoma" w:hAnsi="Tahoma" w:cs="Tahoma"/>
-          <w:szCs w:val="21"/>
-        </w:rPr>
-      </w:pPr>
-      <w:r>
-        <w:rPr>
-          <w:rFonts w:ascii="Tahoma" w:hAnsi="Tahoma" w:cs="Tahoma"/>
-          <w:b/>
-          <w:bCs/>
-          <w:szCs w:val="21"/>
-        </w:rPr>
-        <w:t xml:space="preserve">AI Agent </w:t>
-      </w:r>
-      <w:r>
-        <w:rPr>
-          <w:rFonts w:ascii="Tahoma" w:hAnsi="Tahoma" w:cs="Tahoma"/>
-          <w:b/>
-          <w:bCs/>
-          <w:szCs w:val="21"/>
-        </w:rPr>
-        <w:t>与</w:t>
-      </w:r>
-      <w:r>
-        <w:rPr>
-          <w:rFonts w:ascii="Tahoma" w:hAnsi="Tahoma" w:cs="Tahoma"/>
-          <w:b/>
-          <w:bCs/>
-          <w:szCs w:val="21"/>
-        </w:rPr>
-        <w:t xml:space="preserve"> LLM </w:t>
-      </w:r>
-      <w:r>
-        <w:rPr>
-          <w:rFonts w:ascii="Tahoma" w:hAnsi="Tahoma" w:cs="Tahoma"/>
-          <w:b/>
-          <w:bCs/>
-          <w:szCs w:val="21"/>
-        </w:rPr>
-        <w:t>应用：</w:t>
-      </w:r>
-      <w:r>
-        <w:rPr>
-          <w:rFonts w:ascii="Tahoma" w:hAnsi="Tahoma" w:cs="Tahoma"/>
-          <w:szCs w:val="21"/>
-        </w:rPr>
-        <w:t xml:space="preserve"> </w:t>
-      </w:r>
-      <w:r>
-        <w:rPr>
-          <w:rFonts w:ascii="Tahoma" w:hAnsi="Tahoma" w:cs="Tahoma"/>
-          <w:szCs w:val="21"/>
-        </w:rPr>
-        <w:t>了解</w:t>
-      </w:r>
-      <w:r>
-        <w:rPr>
-          <w:rFonts w:ascii="Tahoma" w:hAnsi="Tahoma" w:cs="Tahoma"/>
-          <w:szCs w:val="21"/>
-        </w:rPr>
-        <w:t xml:space="preserve"> LLM Agent </w:t>
-      </w:r>
-      <w:r>
-        <w:rPr>
-          <w:rFonts w:ascii="Tahoma" w:hAnsi="Tahoma" w:cs="Tahoma"/>
-          <w:szCs w:val="21"/>
-        </w:rPr>
-        <w:t>基本架构，包括</w:t>
-      </w:r>
-      <w:r>
-        <w:rPr>
-          <w:rFonts w:ascii="Tahoma" w:hAnsi="Tahoma" w:cs="Tahoma"/>
-          <w:szCs w:val="21"/>
-        </w:rPr>
-        <w:t xml:space="preserve"> tool calling</w:t>
-      </w:r>
-      <w:r>
-        <w:rPr>
-          <w:rFonts w:ascii="Tahoma" w:hAnsi="Tahoma" w:cs="Tahoma"/>
-          <w:szCs w:val="21"/>
-        </w:rPr>
-        <w:t>、任务分解、</w:t>
-      </w:r>
-      <w:r>
-        <w:rPr>
-          <w:rFonts w:ascii="Tahoma" w:hAnsi="Tahoma" w:cs="Tahoma"/>
-          <w:szCs w:val="21"/>
-        </w:rPr>
-        <w:t xml:space="preserve">RAG </w:t>
-      </w:r>
-      <w:r>
-        <w:rPr>
-          <w:rFonts w:ascii="Tahoma" w:hAnsi="Tahoma" w:cs="Tahoma"/>
-          <w:szCs w:val="21"/>
-        </w:rPr>
-        <w:t>检索增强生成、</w:t>
-      </w:r>
-      <w:r>
-        <w:rPr>
-          <w:rFonts w:ascii="Tahoma" w:hAnsi="Tahoma" w:cs="Tahoma"/>
-          <w:szCs w:val="21"/>
-        </w:rPr>
-        <w:t>prompt engineering</w:t>
-      </w:r>
-      <w:r>
-        <w:rPr>
-          <w:rFonts w:ascii="Tahoma" w:hAnsi="Tahoma" w:cs="Tahoma"/>
-          <w:szCs w:val="21"/>
-        </w:rPr>
-        <w:t>、记忆管理、多轮对</w:t>
-      </w:r>
-      <w:proofErr w:type="gramStart"/>
-      <w:r>
-        <w:rPr>
-          <w:rFonts w:ascii="Tahoma" w:hAnsi="Tahoma" w:cs="Tahoma"/>
-          <w:szCs w:val="21"/>
-        </w:rPr>
-        <w:t>话状态</w:t>
-      </w:r>
-      <w:proofErr w:type="gramEnd"/>
-      <w:r>
-        <w:rPr>
-          <w:rFonts w:ascii="Tahoma" w:hAnsi="Tahoma" w:cs="Tahoma"/>
-          <w:szCs w:val="21"/>
-        </w:rPr>
-        <w:t>管理和</w:t>
-      </w:r>
-      <w:r>
-        <w:rPr>
-          <w:rFonts w:ascii="Tahoma" w:hAnsi="Tahoma" w:cs="Tahoma"/>
-          <w:szCs w:val="21"/>
-        </w:rPr>
-        <w:t xml:space="preserve"> Markdown </w:t>
-      </w:r>
-      <w:r>
-        <w:rPr>
-          <w:rFonts w:ascii="Tahoma" w:hAnsi="Tahoma" w:cs="Tahoma"/>
-          <w:szCs w:val="21"/>
-        </w:rPr>
-        <w:t>报告生成；具备将大模型能力与外部工具、文件系统、数据库、缓存和自动化脚本结合的项目开发经验。</w:t>
-      </w:r>
-    </w:p>
-    <w:p>
-      <w:pPr>
-        <w:rPr>
-          <w:rFonts w:ascii="Tahoma" w:hAnsi="Tahoma" w:cs="Tahoma"/>
-          <w:szCs w:val="21"/>
-        </w:rPr>
-      </w:pPr>
-      <w:r>
-        <w:rPr>
-          <w:rFonts w:ascii="Tahoma" w:hAnsi="Tahoma" w:cs="Tahoma"/>
-          <w:b/>
-          <w:bCs/>
-          <w:szCs w:val="21"/>
-        </w:rPr>
-        <w:t xml:space="preserve">RAG </w:t>
-      </w:r>
-      <w:r>
-        <w:rPr>
-          <w:rFonts w:ascii="Tahoma" w:hAnsi="Tahoma" w:cs="Tahoma"/>
-          <w:b/>
-          <w:bCs/>
-          <w:szCs w:val="21"/>
-        </w:rPr>
-        <w:t>与向量检索：</w:t>
-      </w:r>
-      <w:r>
-        <w:rPr>
-          <w:rFonts w:ascii="Tahoma" w:hAnsi="Tahoma" w:cs="Tahoma"/>
-          <w:szCs w:val="21"/>
-        </w:rPr>
-        <w:t xml:space="preserve"> </w:t>
-      </w:r>
-      <w:r>
-        <w:rPr>
-          <w:rFonts w:ascii="Tahoma" w:hAnsi="Tahoma" w:cs="Tahoma"/>
-          <w:szCs w:val="21"/>
-        </w:rPr>
-        <w:t>了解</w:t>
-      </w:r>
-      <w:r>
-        <w:rPr>
-          <w:rFonts w:ascii="Tahoma" w:hAnsi="Tahoma" w:cs="Tahoma"/>
-          <w:szCs w:val="21"/>
-        </w:rPr>
-        <w:t xml:space="preserve"> Markdown </w:t>
-      </w:r>
-      <w:r>
-        <w:rPr>
-          <w:rFonts w:ascii="Tahoma" w:hAnsi="Tahoma" w:cs="Tahoma"/>
-          <w:szCs w:val="21"/>
-        </w:rPr>
-        <w:t>文档解析、文本切分、</w:t>
-      </w:r>
-      <w:r>
-        <w:rPr>
-          <w:rFonts w:ascii="Tahoma" w:hAnsi="Tahoma" w:cs="Tahoma"/>
-          <w:szCs w:val="21"/>
-        </w:rPr>
-        <w:t xml:space="preserve">embedding </w:t>
-      </w:r>
-      <w:r>
-        <w:rPr>
-          <w:rFonts w:ascii="Tahoma" w:hAnsi="Tahoma" w:cs="Tahoma"/>
-          <w:szCs w:val="21"/>
-        </w:rPr>
-        <w:t>生成、</w:t>
-      </w:r>
-      <w:r>
-        <w:rPr>
-          <w:rFonts w:ascii="Tahoma" w:hAnsi="Tahoma" w:cs="Tahoma"/>
-          <w:szCs w:val="21"/>
-        </w:rPr>
-        <w:t xml:space="preserve">FAISS / Chroma </w:t>
-      </w:r>
-      <w:r>
-        <w:rPr>
-          <w:rFonts w:ascii="Tahoma" w:hAnsi="Tahoma" w:cs="Tahoma"/>
-          <w:szCs w:val="21"/>
-        </w:rPr>
-        <w:t>向量索引、</w:t>
-      </w:r>
-      <w:r>
-        <w:rPr>
-          <w:rFonts w:ascii="Tahoma" w:hAnsi="Tahoma" w:cs="Tahoma"/>
-          <w:szCs w:val="21"/>
-        </w:rPr>
-        <w:t xml:space="preserve">top-k </w:t>
-      </w:r>
-      <w:r>
-        <w:rPr>
-          <w:rFonts w:ascii="Tahoma" w:hAnsi="Tahoma" w:cs="Tahoma"/>
-          <w:szCs w:val="21"/>
-        </w:rPr>
-        <w:t>语义检索和上下文拼接流程；能够围绕领域知识库构建检索增强问答与报告生成系统。</w:t>
-      </w:r>
-    </w:p>
-    <w:p>
-      <w:pPr>
-        <w:rPr>
-          <w:rFonts w:ascii="Tahoma" w:hAnsi="Tahoma" w:cs="Tahoma"/>
-          <w:szCs w:val="21"/>
-        </w:rPr>
-      </w:pPr>
-      <w:r>
-        <w:rPr>
-          <w:rFonts w:ascii="Tahoma" w:hAnsi="Tahoma" w:cs="Tahoma"/>
-          <w:b/>
-          <w:bCs/>
-          <w:szCs w:val="21"/>
-        </w:rPr>
-        <w:t>后端与系统设计基础</w:t>
-      </w:r>
-      <w:r>
-        <w:rPr>
-          <w:rFonts w:ascii="Tahoma" w:hAnsi="Tahoma" w:cs="Tahoma"/>
-          <w:szCs w:val="21"/>
-        </w:rPr>
-        <w:t>：</w:t>
-      </w:r>
-      <w:r>
-        <w:rPr>
-          <w:rFonts w:ascii="Tahoma" w:hAnsi="Tahoma" w:cs="Tahoma"/>
-          <w:szCs w:val="21"/>
-        </w:rPr>
-        <w:t xml:space="preserve"> </w:t>
-      </w:r>
-      <w:r>
-        <w:rPr>
-          <w:rFonts w:ascii="Tahoma" w:hAnsi="Tahoma" w:cs="Tahoma"/>
-          <w:szCs w:val="21"/>
-        </w:rPr>
-        <w:t>了解</w:t>
-      </w:r>
-      <w:r>
-        <w:rPr>
-          <w:rFonts w:ascii="Tahoma" w:hAnsi="Tahoma" w:cs="Tahoma"/>
-          <w:szCs w:val="21"/>
-        </w:rPr>
-        <w:t xml:space="preserve"> </w:t>
-      </w:r>
-      <w:proofErr w:type="spellStart"/>
-      <w:r>
-        <w:rPr>
-          <w:rFonts w:ascii="Tahoma" w:hAnsi="Tahoma" w:cs="Tahoma"/>
-          <w:szCs w:val="21"/>
-        </w:rPr>
-        <w:t>FastAPI</w:t>
-      </w:r>
-      <w:proofErr w:type="spellEnd"/>
-      <w:r>
-        <w:rPr>
-          <w:rFonts w:ascii="Tahoma" w:hAnsi="Tahoma" w:cs="Tahoma"/>
-          <w:szCs w:val="21"/>
-        </w:rPr>
-        <w:t>、</w:t>
-      </w:r>
-      <w:r>
-        <w:rPr>
-          <w:rFonts w:ascii="Tahoma" w:hAnsi="Tahoma" w:cs="Tahoma"/>
-          <w:szCs w:val="21"/>
-        </w:rPr>
-        <w:t>REST API</w:t>
-      </w:r>
-      <w:r>
-        <w:rPr>
-          <w:rFonts w:ascii="Tahoma" w:hAnsi="Tahoma" w:cs="Tahoma"/>
-          <w:szCs w:val="21"/>
-        </w:rPr>
-        <w:t>、</w:t>
-      </w:r>
-      <w:r>
-        <w:rPr>
-          <w:rFonts w:ascii="Tahoma" w:hAnsi="Tahoma" w:cs="Tahoma"/>
-          <w:szCs w:val="21"/>
-        </w:rPr>
-        <w:t>HTTP</w:t>
-      </w:r>
-      <w:r>
-        <w:rPr>
-          <w:rFonts w:ascii="Tahoma" w:hAnsi="Tahoma" w:cs="Tahoma"/>
-          <w:szCs w:val="21"/>
-        </w:rPr>
-        <w:t>、客户端与服务端交互、参数校验、异常处理、日志追踪、</w:t>
-      </w:r>
-      <w:proofErr w:type="spellStart"/>
-      <w:r>
-        <w:rPr>
-          <w:rFonts w:ascii="Tahoma" w:hAnsi="Tahoma" w:cs="Tahoma"/>
-          <w:szCs w:val="21"/>
-        </w:rPr>
-        <w:t>TraceID</w:t>
-      </w:r>
-      <w:proofErr w:type="spellEnd"/>
-      <w:r>
-        <w:rPr>
-          <w:rFonts w:ascii="Tahoma" w:hAnsi="Tahoma" w:cs="Tahoma"/>
-          <w:szCs w:val="21"/>
-        </w:rPr>
-        <w:t>、任务调度、限流、</w:t>
-      </w:r>
-      <w:proofErr w:type="gramStart"/>
-      <w:r>
-        <w:rPr>
-          <w:rFonts w:ascii="Tahoma" w:hAnsi="Tahoma" w:cs="Tahoma"/>
-          <w:szCs w:val="21"/>
-        </w:rPr>
-        <w:t>幂</w:t>
-      </w:r>
-      <w:proofErr w:type="gramEnd"/>
-      <w:r>
-        <w:rPr>
-          <w:rFonts w:ascii="Tahoma" w:hAnsi="Tahoma" w:cs="Tahoma"/>
-          <w:szCs w:val="21"/>
-        </w:rPr>
-        <w:t>等性和可观测性等后端工程概念。</w:t>
-      </w:r>
-    </w:p>
-    <w:p>
-      <w:pPr>
-        <w:rPr>
-          <w:rFonts w:ascii="Tahoma" w:hAnsi="Tahoma" w:cs="Tahoma"/>
-          <w:szCs w:val="21"/>
-        </w:rPr>
-      </w:pPr>
-      <w:r>
-        <w:rPr>
-          <w:rFonts w:ascii="Tahoma" w:hAnsi="Tahoma" w:cs="Tahoma"/>
-          <w:b/>
-          <w:bCs/>
-          <w:szCs w:val="21"/>
-        </w:rPr>
-        <w:t>数据库与缓存</w:t>
-      </w:r>
-      <w:r>
-        <w:rPr>
-          <w:rFonts w:ascii="Tahoma" w:hAnsi="Tahoma" w:cs="Tahoma"/>
-          <w:szCs w:val="21"/>
-        </w:rPr>
-        <w:t>：</w:t>
-      </w:r>
-      <w:r>
-        <w:rPr>
-          <w:rFonts w:ascii="Tahoma" w:hAnsi="Tahoma" w:cs="Tahoma"/>
-          <w:szCs w:val="21"/>
-        </w:rPr>
-        <w:t xml:space="preserve"> </w:t>
-      </w:r>
-      <w:r>
-        <w:rPr>
-          <w:rFonts w:ascii="Tahoma" w:hAnsi="Tahoma" w:cs="Tahoma"/>
-          <w:szCs w:val="21"/>
-        </w:rPr>
-        <w:t>了解</w:t>
-      </w:r>
-      <w:r>
-        <w:rPr>
-          <w:rFonts w:ascii="Tahoma" w:hAnsi="Tahoma" w:cs="Tahoma"/>
-          <w:szCs w:val="21"/>
-        </w:rPr>
-        <w:t xml:space="preserve"> MySQL / SQLite </w:t>
-      </w:r>
-      <w:r>
-        <w:rPr>
-          <w:rFonts w:ascii="Tahoma" w:hAnsi="Tahoma" w:cs="Tahoma"/>
-          <w:szCs w:val="21"/>
-        </w:rPr>
-        <w:t>基础使用，理解索引、事务、锁、查询优化等数据库基础概念；了解</w:t>
-      </w:r>
-      <w:r>
-        <w:rPr>
-          <w:rFonts w:ascii="Tahoma" w:hAnsi="Tahoma" w:cs="Tahoma"/>
-          <w:szCs w:val="21"/>
-        </w:rPr>
-        <w:t xml:space="preserve"> Redis </w:t>
-      </w:r>
-      <w:r>
-        <w:rPr>
-          <w:rFonts w:ascii="Tahoma" w:hAnsi="Tahoma" w:cs="Tahoma"/>
-          <w:szCs w:val="21"/>
-        </w:rPr>
-        <w:t>常用缓存场景，包括热点查询缓存、短期会话状态、</w:t>
-      </w:r>
-      <w:r>
-        <w:rPr>
-          <w:rFonts w:ascii="Tahoma" w:hAnsi="Tahoma" w:cs="Tahoma"/>
-          <w:szCs w:val="21"/>
-        </w:rPr>
-        <w:t>TTL</w:t>
-      </w:r>
-      <w:r>
-        <w:rPr>
-          <w:rFonts w:ascii="Tahoma" w:hAnsi="Tahoma" w:cs="Tahoma"/>
-          <w:szCs w:val="21"/>
-        </w:rPr>
-        <w:t>、缓存穿透、缓存击穿和缓存一致性。</w:t>
-      </w:r>
-    </w:p>
-    <w:p>
-      <w:pPr>
-        <w:rPr>
-          <w:rFonts w:ascii="Tahoma" w:hAnsi="Tahoma" w:cs="Tahoma"/>
-          <w:szCs w:val="21"/>
-        </w:rPr>
-      </w:pPr>
-      <w:r>
-        <w:rPr>
-          <w:rFonts w:ascii="Tahoma" w:hAnsi="Tahoma" w:cs="Tahoma"/>
-          <w:b/>
-          <w:bCs/>
-          <w:szCs w:val="21"/>
-        </w:rPr>
-        <w:t>机器学习与数据分析</w:t>
-      </w:r>
-      <w:r>
-        <w:rPr>
-          <w:rFonts w:ascii="Tahoma" w:hAnsi="Tahoma" w:cs="Tahoma"/>
-          <w:szCs w:val="21"/>
-        </w:rPr>
-        <w:t>：</w:t>
-      </w:r>
-      <w:r>
-        <w:rPr>
-          <w:rFonts w:ascii="Tahoma" w:hAnsi="Tahoma" w:cs="Tahoma"/>
-          <w:szCs w:val="21"/>
-        </w:rPr>
-        <w:t xml:space="preserve"> </w:t>
-      </w:r>
-      <w:r>
-        <w:rPr>
-          <w:rFonts w:ascii="Tahoma" w:hAnsi="Tahoma" w:cs="Tahoma"/>
-          <w:szCs w:val="21"/>
-        </w:rPr>
-        <w:t>熟悉</w:t>
-      </w:r>
-      <w:r>
-        <w:rPr>
-          <w:rFonts w:ascii="Tahoma" w:hAnsi="Tahoma" w:cs="Tahoma"/>
-          <w:szCs w:val="21"/>
-        </w:rPr>
-        <w:t xml:space="preserve"> </w:t>
-      </w:r>
-      <w:proofErr w:type="spellStart"/>
-      <w:r>
-        <w:rPr>
-          <w:rFonts w:ascii="Tahoma" w:hAnsi="Tahoma" w:cs="Tahoma"/>
-          <w:szCs w:val="21"/>
-        </w:rPr>
-        <w:t>PyTorch</w:t>
-      </w:r>
-      <w:proofErr w:type="spellEnd"/>
-      <w:r>
-        <w:rPr>
-          <w:rFonts w:ascii="Tahoma" w:hAnsi="Tahoma" w:cs="Tahoma"/>
-          <w:szCs w:val="21"/>
-        </w:rPr>
-        <w:t>，具备深度学习和多智能体强化学习算法实现与实验评估经验；熟悉</w:t>
-      </w:r>
-      <w:r>
-        <w:rPr>
-          <w:rFonts w:ascii="Tahoma" w:hAnsi="Tahoma" w:cs="Tahoma"/>
-          <w:szCs w:val="21"/>
-        </w:rPr>
-        <w:t xml:space="preserve"> Pandas</w:t>
-      </w:r>
-      <w:r>
-        <w:rPr>
-          <w:rFonts w:ascii="Tahoma" w:hAnsi="Tahoma" w:cs="Tahoma"/>
-          <w:szCs w:val="21"/>
-        </w:rPr>
-        <w:t>、</w:t>
-      </w:r>
-      <w:r>
-        <w:rPr>
-          <w:rFonts w:ascii="Tahoma" w:hAnsi="Tahoma" w:cs="Tahoma"/>
-          <w:szCs w:val="21"/>
-        </w:rPr>
-        <w:t>NumPy</w:t>
-      </w:r>
-      <w:r>
-        <w:rPr>
-          <w:rFonts w:ascii="Tahoma" w:hAnsi="Tahoma" w:cs="Tahoma"/>
-          <w:szCs w:val="21"/>
-        </w:rPr>
-        <w:t>、</w:t>
-      </w:r>
-      <w:r>
-        <w:rPr>
-          <w:rFonts w:ascii="Tahoma" w:hAnsi="Tahoma" w:cs="Tahoma"/>
-          <w:szCs w:val="21"/>
-        </w:rPr>
-        <w:t>Matplotlib</w:t>
-      </w:r>
-      <w:r>
-        <w:rPr>
-          <w:rFonts w:ascii="Tahoma" w:hAnsi="Tahoma" w:cs="Tahoma"/>
-          <w:szCs w:val="21"/>
-        </w:rPr>
-        <w:t>，可完成结构化数据处理、指标计算、实验日志分析和可视化。</w:t>
-      </w:r>
-    </w:p>
-    <w:p>
-      <w:pPr>
-        <w:rPr>
-          <w:rFonts w:ascii="Tahoma" w:hAnsi="Tahoma" w:cs="Tahoma"/>
-          <w:szCs w:val="21"/>
-        </w:rPr>
-      </w:pPr>
-      <w:r>
-        <w:rPr>
-          <w:rFonts w:ascii="Tahoma" w:hAnsi="Tahoma" w:cs="Tahoma"/>
-          <w:b/>
-          <w:bCs/>
-          <w:szCs w:val="21"/>
-        </w:rPr>
-        <w:t>工具与开发环境</w:t>
-      </w:r>
-      <w:r>
-        <w:rPr>
-          <w:rFonts w:ascii="Tahoma" w:hAnsi="Tahoma" w:cs="Tahoma"/>
-          <w:szCs w:val="21"/>
-        </w:rPr>
-        <w:t>：</w:t>
-      </w:r>
-      <w:r>
-        <w:rPr>
-          <w:rFonts w:ascii="Tahoma" w:hAnsi="Tahoma" w:cs="Tahoma"/>
-          <w:szCs w:val="21"/>
-        </w:rPr>
-        <w:t xml:space="preserve"> </w:t>
-      </w:r>
-      <w:r>
-        <w:rPr>
-          <w:rFonts w:ascii="Tahoma" w:hAnsi="Tahoma" w:cs="Tahoma"/>
-          <w:szCs w:val="21"/>
-        </w:rPr>
-        <w:t>熟悉</w:t>
-      </w:r>
-      <w:r>
-        <w:rPr>
-          <w:rFonts w:ascii="Tahoma" w:hAnsi="Tahoma" w:cs="Tahoma"/>
-          <w:szCs w:val="21"/>
-        </w:rPr>
-        <w:t xml:space="preserve"> Linux</w:t>
-      </w:r>
-      <w:r>
-        <w:rPr>
-          <w:rFonts w:ascii="Tahoma" w:hAnsi="Tahoma" w:cs="Tahoma"/>
-          <w:szCs w:val="21"/>
-        </w:rPr>
-        <w:t>、</w:t>
-      </w:r>
-      <w:r>
-        <w:rPr>
-          <w:rFonts w:ascii="Tahoma" w:hAnsi="Tahoma" w:cs="Tahoma"/>
-          <w:szCs w:val="21"/>
-        </w:rPr>
-        <w:t>Bash</w:t>
-      </w:r>
-      <w:r>
-        <w:rPr>
-          <w:rFonts w:ascii="Tahoma" w:hAnsi="Tahoma" w:cs="Tahoma"/>
-          <w:szCs w:val="21"/>
-        </w:rPr>
-        <w:t>、</w:t>
-      </w:r>
-      <w:r>
-        <w:rPr>
-          <w:rFonts w:ascii="Tahoma" w:hAnsi="Tahoma" w:cs="Tahoma"/>
-          <w:szCs w:val="21"/>
-        </w:rPr>
-        <w:t>Git</w:t>
-      </w:r>
-      <w:r>
-        <w:rPr>
-          <w:rFonts w:ascii="Tahoma" w:hAnsi="Tahoma" w:cs="Tahoma"/>
-          <w:szCs w:val="21"/>
-        </w:rPr>
-        <w:t>、</w:t>
-      </w:r>
-      <w:r>
-        <w:rPr>
-          <w:rFonts w:ascii="Tahoma" w:hAnsi="Tahoma" w:cs="Tahoma"/>
-          <w:szCs w:val="21"/>
-        </w:rPr>
-        <w:t>VS Code</w:t>
-      </w:r>
-      <w:r>
-        <w:rPr>
-          <w:rFonts w:ascii="Tahoma" w:hAnsi="Tahoma" w:cs="Tahoma"/>
-          <w:szCs w:val="21"/>
-        </w:rPr>
-        <w:t>、</w:t>
-      </w:r>
-      <w:r>
-        <w:rPr>
-          <w:rFonts w:ascii="Tahoma" w:hAnsi="Tahoma" w:cs="Tahoma"/>
-          <w:szCs w:val="21"/>
-        </w:rPr>
-        <w:t xml:space="preserve">Docker </w:t>
-      </w:r>
-      <w:r>
-        <w:rPr>
-          <w:rFonts w:ascii="Tahoma" w:hAnsi="Tahoma" w:cs="Tahoma"/>
-          <w:szCs w:val="21"/>
-        </w:rPr>
-        <w:t>基础操作；具备使用自动化脚本管理实验、处理日志、维护项目文档和构建可复现开发流程的经验。</w:t>
-      </w:r>
-    </w:p>
-    <w:p>
-      <w:pPr>
-        <w:rPr>
-          <w:rFonts w:ascii="Tahoma" w:hAnsi="Tahoma" w:cs="Tahoma"/>
-          <w:szCs w:val="21"/>
-        </w:rPr>
-      </w:pPr>
-      <w:r>
-        <w:rPr>
-          <w:rFonts w:ascii="Tahoma" w:hAnsi="Tahoma" w:cs="Tahoma"/>
-          <w:szCs w:val="21"/>
-        </w:rPr>
-        <w:pict w14:anchorId="7AC9BCB5">
-          <v:rect id="_x0000_i1029" style="width:0;height:1.5pt" o:hralign="center" o:hrstd="t" o:hr="t" fillcolor="#a0a0a0" stroked="f"/>
         </w:pict>
       </w:r>
     </w:p>
@@ -5989,6 +6010,7 @@
   <w:style w:type="character" w:default="1" w:styleId="a0">
     <w:name w:val="Default Paragraph Font"/>
     <w:uiPriority w:val="1"/>
+    <w:semiHidden/>
     <w:unhideWhenUsed/>
   </w:style>
   <w:style w:type="table" w:default="1" w:styleId="a1">

</xml_diff>